<commit_message>
thêm một số chữ
</commit_message>
<xml_diff>
--- a/Hệ thống nhà sách.docx
+++ b/Hệ thống nhà sách.docx
@@ -70,7 +70,35 @@
           <w:sz w:val="28"/>
           <w:szCs w:val="28"/>
         </w:rPr>
-        <w:t>Nhân viên thực hiện kiểm tra mặc hàng trong nhà sách vào cuối tuần, nếu hàng còn ít hoặc đã hết, nhân viên thực hiện gửi yêu cầu nhập hàng đến kho hàng thực hiện nhập hàng vào nhà sách. Khi nhập hàng, nhân viên giao hàng gửi cho nhân viên nhà sách hóa đơn nhập hàng gồm thông tin hàng, số lượng, đơn giá, ngày nhập hàng.</w:t>
+        <w:t>Nhân viên thực hiện kiểm tra mặc hàng trong nhà sách vào cuối tuần, nếu hàng còn ít hoặc đã hết, nhân viên thực hiện gửi yêu cầu nhập hàng đến kho hàng thực hiện nhập hàng vào nhà sách. Khi nhập hàng, nhân viên giao hàng gửi cho nhân viên nhà sách hóa đơn nhập hàng gồm thông tin hàng, số lượng, đơn giá, ngày nhập hàng</w:t>
+      </w:r>
+      <w:r>
+        <w:rPr>
+          <w:sz w:val="28"/>
+          <w:szCs w:val="28"/>
+        </w:rPr>
+        <w:t>,..</w:t>
+      </w:r>
+      <w:r>
+        <w:rPr>
+          <w:sz w:val="28"/>
+          <w:szCs w:val="28"/>
+        </w:rPr>
+        <w:t>.</w:t>
+      </w:r>
+      <w:r>
+        <w:rPr>
+          <w:sz w:val="28"/>
+          <w:szCs w:val="28"/>
+        </w:rPr>
+        <w:t xml:space="preserve"> Các mặt hàng bao gồm mã hàng, tên hàng, đơn vị tính, số lượng, đơn giá,… Mỗi ngày nhân viên đến và làm việc đều phải chấm công. Thông tin nhân viên bao gồm mã nhân viên, tên nhân viên, giới tính, số điện thoại, cccd,…</w:t>
+      </w:r>
+      <w:r>
+        <w:rPr>
+          <w:sz w:val="28"/>
+          <w:szCs w:val="28"/>
+        </w:rPr>
+        <w:t xml:space="preserve"> </w:t>
       </w:r>
     </w:p>
     <w:sectPr>

</xml_diff>

<commit_message>
Thêm thông tin docx
</commit_message>
<xml_diff>
--- a/Hệ thống nhà sách.docx
+++ b/Hệ thống nhà sách.docx
@@ -21,7 +21,7 @@
           <w:sz w:val="32"/>
           <w:szCs w:val="32"/>
         </w:rPr>
-        <w:t xml:space="preserve">Hệ thống nhà sách </w:t>
+        <w:t>Hệ thống nhà sách</w:t>
       </w:r>
     </w:p>
     <w:p>
@@ -34,13 +34,17 @@
         <w:jc w:val="both"/>
         <w:rPr>
           <w:rFonts w:ascii="Times New Roman" w:hAnsi="Times New Roman" w:cs="Times New Roman"/>
-          <w:sz w:val="28"/>
-          <w:szCs w:val="28"/>
-        </w:rPr>
-      </w:pPr>
-      <w:r>
-        <w:rPr>
-          <w:rFonts w:ascii="Times New Roman" w:hAnsi="Times New Roman" w:cs="Times New Roman"/>
+          <w:b/>
+          <w:bCs/>
+          <w:sz w:val="28"/>
+          <w:szCs w:val="28"/>
+        </w:rPr>
+      </w:pPr>
+      <w:r>
+        <w:rPr>
+          <w:rFonts w:ascii="Times New Roman" w:hAnsi="Times New Roman" w:cs="Times New Roman"/>
+          <w:b/>
+          <w:bCs/>
           <w:sz w:val="28"/>
           <w:szCs w:val="28"/>
         </w:rPr>
@@ -49,87 +53,91 @@
     </w:p>
     <w:p>
       <w:pPr>
+        <w:ind w:left="720" w:firstLine="720"/>
+        <w:jc w:val="both"/>
+        <w:rPr>
+          <w:rFonts w:ascii="Times New Roman" w:hAnsi="Times New Roman" w:cs="Times New Roman"/>
+          <w:sz w:val="28"/>
+          <w:szCs w:val="28"/>
+        </w:rPr>
+      </w:pPr>
+      <w:r>
+        <w:rPr>
+          <w:rFonts w:ascii="Times New Roman" w:hAnsi="Times New Roman" w:cs="Times New Roman"/>
+          <w:sz w:val="28"/>
+          <w:szCs w:val="28"/>
+        </w:rPr>
+        <w:t xml:space="preserve">Khách hàng đến nhà sách mua sách và nhu yếu phẩm để học tập. Khi lựa chọn xong các sản phẩm cần thiết, khách hàng đến quầy nhân viên để thực hiện thanh toán. Nhân viên nhập thông tin và số lượng các nhu yếu phẩm mà khách hàng đã lựa chọn. Nhân viên thực hiện thanh toán các nhu yếu phẩm mà khách hàng đã lựa chọn. Khách hàng có thể cung cấp thông tin của mình cho nhân viên. Sau khi thanh toán, nhân viên thực hiện lưu và xuất hóa đơn cho khách hàng. </w:t>
+      </w:r>
+    </w:p>
+    <w:p>
+      <w:pPr>
+        <w:ind w:left="720" w:firstLine="720"/>
+        <w:jc w:val="both"/>
+        <w:rPr>
+          <w:rFonts w:ascii="Times New Roman" w:hAnsi="Times New Roman" w:cs="Times New Roman"/>
+          <w:sz w:val="28"/>
+          <w:szCs w:val="28"/>
+        </w:rPr>
+      </w:pPr>
+      <w:r>
+        <w:rPr>
+          <w:rFonts w:ascii="Times New Roman" w:hAnsi="Times New Roman" w:cs="Times New Roman"/>
+          <w:sz w:val="28"/>
+          <w:szCs w:val="28"/>
+        </w:rPr>
+        <w:t>Nhân viên thực hiện kiểm tra mặc hàng trong nhà sách vào cuối tuần, nếu hàng còn ít hoặc đã hết, nhân viên thực hiện gửi yêu cầu nhập hàng đến kho hàng thực hiện nhập hàng vào nhà sách. Khi nhập hàng, nhân viên giao hàng gửi cho nhân viên nhà sách hóa đơn nhập hàng gồm thông tin hàng, số lượng, đơn giá, ngày nhập hàng</w:t>
+      </w:r>
+      <w:r>
+        <w:rPr>
+          <w:rFonts w:ascii="Times New Roman" w:hAnsi="Times New Roman" w:cs="Times New Roman"/>
+          <w:sz w:val="28"/>
+          <w:szCs w:val="28"/>
+        </w:rPr>
+        <w:t>,..</w:t>
+      </w:r>
+      <w:r>
+        <w:rPr>
+          <w:rFonts w:ascii="Times New Roman" w:hAnsi="Times New Roman" w:cs="Times New Roman"/>
+          <w:sz w:val="28"/>
+          <w:szCs w:val="28"/>
+        </w:rPr>
+        <w:t>.</w:t>
+      </w:r>
+      <w:r>
+        <w:rPr>
+          <w:rFonts w:ascii="Times New Roman" w:hAnsi="Times New Roman" w:cs="Times New Roman"/>
+          <w:sz w:val="28"/>
+          <w:szCs w:val="28"/>
+        </w:rPr>
+        <w:t xml:space="preserve"> Các mặt hàng bao gồm mã hàng, tên hàng, đơn vị tính, số lượng, đơn giá,… Mỗi ngày nhân viên đến và làm việc đều phải chấm công. Thông tin nhân viên bao gồm mã nhân viên, tên nhân viên, giới tính, số điện thoại, cccd,…</w:t>
+      </w:r>
+      <w:r>
+        <w:rPr>
+          <w:rFonts w:ascii="Times New Roman" w:hAnsi="Times New Roman" w:cs="Times New Roman"/>
+          <w:sz w:val="28"/>
+          <w:szCs w:val="28"/>
+        </w:rPr>
+        <w:t xml:space="preserve"> </w:t>
+      </w:r>
+    </w:p>
+    <w:p>
+      <w:pPr>
         <w:ind w:left="720"/>
         <w:jc w:val="both"/>
         <w:rPr>
           <w:rFonts w:ascii="Times New Roman" w:hAnsi="Times New Roman" w:cs="Times New Roman"/>
-          <w:sz w:val="28"/>
-          <w:szCs w:val="28"/>
-        </w:rPr>
-      </w:pPr>
-      <w:r>
-        <w:rPr>
-          <w:rFonts w:ascii="Times New Roman" w:hAnsi="Times New Roman" w:cs="Times New Roman"/>
-          <w:sz w:val="28"/>
-          <w:szCs w:val="28"/>
-        </w:rPr>
-        <w:t xml:space="preserve">Khách hàng đến nhà sách mua sách và nhu yếu phẩm để học tập. Khi lựa chọn xong các sản phẩm cần thiết, khách hàng đến quầy nhân viên để thực hiện thanh toán. Nhân viên nhập thông tin và số lượng các nhu yếu phẩm mà khách hàng đã lựa chọn. Nhân viên thực hiện thanh toán các nhu yếu phẩm mà khách hàng đã lựa chọn. Khách hàng có thể cung cấp thông tin của mình cho nhân viên. Sau khi thanh toán, nhân viên thực hiện lưu và xuất hóa đơn cho khách hàng. </w:t>
-      </w:r>
-    </w:p>
-    <w:p>
-      <w:pPr>
-        <w:ind w:left="720"/>
-        <w:jc w:val="both"/>
-        <w:rPr>
-          <w:rFonts w:ascii="Times New Roman" w:hAnsi="Times New Roman" w:cs="Times New Roman"/>
-          <w:sz w:val="28"/>
-          <w:szCs w:val="28"/>
-        </w:rPr>
-      </w:pPr>
-      <w:r>
-        <w:rPr>
-          <w:rFonts w:ascii="Times New Roman" w:hAnsi="Times New Roman" w:cs="Times New Roman"/>
-          <w:sz w:val="28"/>
-          <w:szCs w:val="28"/>
-        </w:rPr>
-        <w:t>Nhân viên thực hiện kiểm tra mặc hàng trong nhà sách vào cuối tuần, nếu hàng còn ít hoặc đã hết, nhân viên thực hiện gửi yêu cầu nhập hàng đến kho hàng thực hiện nhập hàng vào nhà sách. Khi nhập hàng, nhân viên giao hàng gửi cho nhân viên nhà sách hóa đơn nhập hàng gồm thông tin hàng, số lượng, đơn giá, ngày nhập hàng</w:t>
-      </w:r>
-      <w:r>
-        <w:rPr>
-          <w:rFonts w:ascii="Times New Roman" w:hAnsi="Times New Roman" w:cs="Times New Roman"/>
-          <w:sz w:val="28"/>
-          <w:szCs w:val="28"/>
-        </w:rPr>
-        <w:t>,..</w:t>
-      </w:r>
-      <w:r>
-        <w:rPr>
-          <w:rFonts w:ascii="Times New Roman" w:hAnsi="Times New Roman" w:cs="Times New Roman"/>
-          <w:sz w:val="28"/>
-          <w:szCs w:val="28"/>
-        </w:rPr>
-        <w:t>.</w:t>
-      </w:r>
-      <w:r>
-        <w:rPr>
-          <w:rFonts w:ascii="Times New Roman" w:hAnsi="Times New Roman" w:cs="Times New Roman"/>
-          <w:sz w:val="28"/>
-          <w:szCs w:val="28"/>
-        </w:rPr>
-        <w:t xml:space="preserve"> Các mặt hàng bao gồm mã hàng, tên hàng, đơn vị tính, số lượng, đơn giá,… Mỗi ngày nhân viên đến và làm việc đều phải chấm công. Thông tin nhân viên bao gồm mã nhân viên, tên nhân viên, giới tính, số điện thoại, cccd,…</w:t>
-      </w:r>
-      <w:r>
-        <w:rPr>
-          <w:rFonts w:ascii="Times New Roman" w:hAnsi="Times New Roman" w:cs="Times New Roman"/>
-          <w:sz w:val="28"/>
-          <w:szCs w:val="28"/>
-        </w:rPr>
-        <w:t xml:space="preserve"> </w:t>
-      </w:r>
-    </w:p>
-    <w:p>
-      <w:pPr>
-        <w:ind w:left="720"/>
-        <w:jc w:val="both"/>
-        <w:rPr>
-          <w:rFonts w:ascii="Times New Roman" w:hAnsi="Times New Roman" w:cs="Times New Roman"/>
-          <w:sz w:val="28"/>
-          <w:szCs w:val="28"/>
-        </w:rPr>
-      </w:pPr>
-      <w:r>
-        <w:rPr>
-          <w:rFonts w:ascii="Times New Roman" w:hAnsi="Times New Roman" w:cs="Times New Roman"/>
+          <w:b/>
+          <w:bCs/>
+          <w:sz w:val="28"/>
+          <w:szCs w:val="28"/>
+        </w:rPr>
+      </w:pPr>
+      <w:r>
+        <w:rPr>
+          <w:rFonts w:ascii="Times New Roman" w:hAnsi="Times New Roman" w:cs="Times New Roman"/>
+          <w:b/>
+          <w:bCs/>
           <w:sz w:val="28"/>
           <w:szCs w:val="28"/>
         </w:rPr>
@@ -638,6 +646,1055 @@
           <w:szCs w:val="28"/>
         </w:rPr>
       </w:pPr>
+    </w:p>
+    <w:p>
+      <w:pPr>
+        <w:ind w:left="720"/>
+        <w:jc w:val="both"/>
+        <w:rPr>
+          <w:rFonts w:ascii="Times New Roman" w:hAnsi="Times New Roman" w:cs="Times New Roman"/>
+          <w:b/>
+          <w:bCs/>
+          <w:sz w:val="28"/>
+          <w:szCs w:val="28"/>
+        </w:rPr>
+      </w:pPr>
+      <w:r>
+        <w:rPr>
+          <w:rFonts w:ascii="Times New Roman" w:hAnsi="Times New Roman" w:cs="Times New Roman"/>
+          <w:b/>
+          <w:bCs/>
+          <w:sz w:val="28"/>
+          <w:szCs w:val="28"/>
+        </w:rPr>
+        <w:t>Luồn</w:t>
+      </w:r>
+      <w:r>
+        <w:rPr>
+          <w:rFonts w:ascii="Times New Roman" w:hAnsi="Times New Roman" w:cs="Times New Roman"/>
+          <w:b/>
+          <w:bCs/>
+          <w:sz w:val="28"/>
+          <w:szCs w:val="28"/>
+        </w:rPr>
+        <w:t>g</w:t>
+      </w:r>
+      <w:r>
+        <w:rPr>
+          <w:rFonts w:ascii="Times New Roman" w:hAnsi="Times New Roman" w:cs="Times New Roman"/>
+          <w:b/>
+          <w:bCs/>
+          <w:sz w:val="28"/>
+          <w:szCs w:val="28"/>
+        </w:rPr>
+        <w:t xml:space="preserve"> xử lý</w:t>
+      </w:r>
+      <w:r>
+        <w:rPr>
+          <w:rFonts w:ascii="Times New Roman" w:hAnsi="Times New Roman" w:cs="Times New Roman"/>
+          <w:b/>
+          <w:bCs/>
+          <w:sz w:val="28"/>
+          <w:szCs w:val="28"/>
+        </w:rPr>
+        <w:t>:</w:t>
+      </w:r>
+    </w:p>
+    <w:p>
+      <w:pPr>
+        <w:ind w:firstLine="720"/>
+        <w:jc w:val="both"/>
+        <w:rPr>
+          <w:rFonts w:ascii="Times New Roman" w:hAnsi="Times New Roman" w:cs="Times New Roman"/>
+          <w:sz w:val="28"/>
+          <w:szCs w:val="28"/>
+        </w:rPr>
+      </w:pPr>
+      <w:r>
+        <w:rPr>
+          <w:rFonts w:ascii="Times New Roman" w:hAnsi="Times New Roman" w:cs="Times New Roman"/>
+          <w:sz w:val="28"/>
+          <w:szCs w:val="28"/>
+        </w:rPr>
+        <w:t>Xử lý đơn hàng: Login -&gt; Thêm đơn hàng -&gt; Chọn sản phẩm -&gt; Thêm vào giỏ hàng -&gt; Thêm thành viên nhà sách (Nếu có) -&gt; Thanh toán -&gt; Kết thúc.</w:t>
+      </w:r>
+    </w:p>
+    <w:p>
+      <w:pPr>
+        <w:jc w:val="both"/>
+        <w:rPr>
+          <w:rFonts w:ascii="Times New Roman" w:hAnsi="Times New Roman" w:cs="Times New Roman"/>
+          <w:sz w:val="28"/>
+          <w:szCs w:val="28"/>
+        </w:rPr>
+      </w:pPr>
+      <w:r>
+        <w:rPr>
+          <w:rFonts w:ascii="Times New Roman" w:hAnsi="Times New Roman" w:cs="Times New Roman"/>
+          <w:sz w:val="28"/>
+          <w:szCs w:val="28"/>
+        </w:rPr>
+        <w:tab/>
+        <w:t>Nhập hàng: Login -&gt; Thêm đơn nhập hàng -&gt; Nhập sản phẩm nhập hàng -&gt; Thêm thông tin nhân viên giao hàng -&gt; Nhập hàng -&gt; Kết thúc.</w:t>
+      </w:r>
+    </w:p>
+    <w:p>
+      <w:pPr>
+        <w:jc w:val="both"/>
+        <w:rPr>
+          <w:rFonts w:ascii="Times New Roman" w:hAnsi="Times New Roman" w:cs="Times New Roman"/>
+          <w:sz w:val="28"/>
+          <w:szCs w:val="28"/>
+        </w:rPr>
+      </w:pPr>
+      <w:r>
+        <w:rPr>
+          <w:rFonts w:ascii="Times New Roman" w:hAnsi="Times New Roman" w:cs="Times New Roman"/>
+          <w:sz w:val="28"/>
+          <w:szCs w:val="28"/>
+        </w:rPr>
+        <w:tab/>
+        <w:t>Xuất hàng -&gt; Login -&gt; Tạo đơn xuất hàng -&gt; Nhập thông tin hàng xuất -&gt; Xuất hàng -&gt; Kết thúc.</w:t>
+      </w:r>
+    </w:p>
+    <w:p>
+      <w:pPr>
+        <w:jc w:val="both"/>
+        <w:rPr>
+          <w:rFonts w:ascii="Times New Roman" w:hAnsi="Times New Roman" w:cs="Times New Roman"/>
+          <w:sz w:val="28"/>
+          <w:szCs w:val="28"/>
+        </w:rPr>
+      </w:pPr>
+      <w:r>
+        <w:rPr>
+          <w:rFonts w:ascii="Times New Roman" w:hAnsi="Times New Roman" w:cs="Times New Roman"/>
+          <w:sz w:val="28"/>
+          <w:szCs w:val="28"/>
+        </w:rPr>
+        <w:tab/>
+        <w:t>Thêm/ Sửa khách hàng: Login -&gt; Quản lý khách hàng -&gt; Thêm/ Sửa khách hàng -&gt; Nhập thông tin khách hàng -&gt; Thêm khách hàng -&gt; Kết thúc.</w:t>
+      </w:r>
+    </w:p>
+    <w:p>
+      <w:pPr>
+        <w:ind w:firstLine="720"/>
+        <w:jc w:val="both"/>
+        <w:rPr>
+          <w:rFonts w:ascii="Times New Roman" w:hAnsi="Times New Roman" w:cs="Times New Roman"/>
+          <w:sz w:val="28"/>
+          <w:szCs w:val="28"/>
+        </w:rPr>
+      </w:pPr>
+      <w:r>
+        <w:rPr>
+          <w:rFonts w:ascii="Times New Roman" w:hAnsi="Times New Roman" w:cs="Times New Roman"/>
+          <w:sz w:val="28"/>
+          <w:szCs w:val="28"/>
+        </w:rPr>
+        <w:lastRenderedPageBreak/>
+        <w:t>Thêm/ Sửa nhà cung cấp: Login -&gt; Quản lý nhà cung cấp -&gt; Thêm/ Sửa nhà cung cấp -&gt; Nhập thông tin nhà cung cấp -&gt; Thêm nhà cung cấp -&gt; Kết thúc</w:t>
+      </w:r>
+    </w:p>
+    <w:p>
+      <w:pPr>
+        <w:ind w:firstLine="720"/>
+        <w:jc w:val="both"/>
+        <w:rPr>
+          <w:rFonts w:ascii="Times New Roman" w:hAnsi="Times New Roman" w:cs="Times New Roman"/>
+          <w:sz w:val="28"/>
+          <w:szCs w:val="28"/>
+        </w:rPr>
+      </w:pPr>
+      <w:r>
+        <w:rPr>
+          <w:rFonts w:ascii="Times New Roman" w:hAnsi="Times New Roman" w:cs="Times New Roman"/>
+          <w:sz w:val="28"/>
+          <w:szCs w:val="28"/>
+        </w:rPr>
+        <w:t>Thêm/ Sửa sản phẩm: Login -&gt; Quản lý sản phẩm -&gt; Thêm/ Sửa sản phẩm -&gt; Nhập thông tin sản phẩm -&gt; Chọn loại sản phẩm -&gt; Thêm/ Sửa sản phẩm.</w:t>
+      </w:r>
+    </w:p>
+    <w:p>
+      <w:pPr>
+        <w:ind w:firstLine="720"/>
+        <w:jc w:val="both"/>
+        <w:rPr>
+          <w:rFonts w:ascii="Times New Roman" w:hAnsi="Times New Roman" w:cs="Times New Roman"/>
+          <w:sz w:val="28"/>
+          <w:szCs w:val="28"/>
+        </w:rPr>
+      </w:pPr>
+      <w:r>
+        <w:rPr>
+          <w:rFonts w:ascii="Times New Roman" w:hAnsi="Times New Roman" w:cs="Times New Roman"/>
+          <w:sz w:val="28"/>
+          <w:szCs w:val="28"/>
+        </w:rPr>
+        <w:t>Thêm/ Sửa nhân viên: Login -&gt; Quản lý nhân viên -&gt; Thêm/ Sửa nhân viên -&gt; Thêm/ Sửa nhân viên -&gt; Kết thúc.</w:t>
+      </w:r>
+    </w:p>
+    <w:p>
+      <w:pPr>
+        <w:jc w:val="both"/>
+        <w:rPr>
+          <w:rFonts w:ascii="Times New Roman" w:hAnsi="Times New Roman" w:cs="Times New Roman"/>
+          <w:sz w:val="28"/>
+          <w:szCs w:val="28"/>
+        </w:rPr>
+      </w:pPr>
+      <w:r>
+        <w:rPr>
+          <w:rFonts w:ascii="Times New Roman" w:hAnsi="Times New Roman" w:cs="Times New Roman"/>
+          <w:sz w:val="28"/>
+          <w:szCs w:val="28"/>
+        </w:rPr>
+        <w:tab/>
+        <w:t>Cấp quyền nhân viên: Login (Admin) -&gt; Quản lý tài khoản -&gt; Thêm Tài khoản -&gt; Chọn nhân viên chưa cấp quyền -&gt; Thêm username/ password -&gt; Chọn quyền -&gt; Thêm tài khoản -&gt; Kết thúc.</w:t>
+      </w:r>
+    </w:p>
+    <w:tbl>
+      <w:tblPr>
+        <w:tblStyle w:val="TableGrid"/>
+        <w:tblW w:w="0" w:type="auto"/>
+        <w:tblLook w:val="04A0" w:firstRow="1" w:lastRow="0" w:firstColumn="1" w:lastColumn="0" w:noHBand="0" w:noVBand="1"/>
+      </w:tblPr>
+      <w:tblGrid>
+        <w:gridCol w:w="563"/>
+        <w:gridCol w:w="916"/>
+        <w:gridCol w:w="2985"/>
+        <w:gridCol w:w="2217"/>
+        <w:gridCol w:w="1519"/>
+        <w:gridCol w:w="1150"/>
+      </w:tblGrid>
+      <w:tr>
+        <w:tc>
+          <w:tcPr>
+            <w:tcW w:w="593" w:type="dxa"/>
+            <w:vAlign w:val="center"/>
+          </w:tcPr>
+          <w:p>
+            <w:pPr>
+              <w:jc w:val="center"/>
+              <w:rPr>
+                <w:rFonts w:ascii="Times New Roman" w:hAnsi="Times New Roman" w:cs="Times New Roman"/>
+                <w:b/>
+                <w:bCs/>
+                <w:sz w:val="28"/>
+                <w:szCs w:val="28"/>
+              </w:rPr>
+            </w:pPr>
+            <w:r>
+              <w:rPr>
+                <w:rFonts w:ascii="Times New Roman" w:hAnsi="Times New Roman" w:cs="Times New Roman"/>
+                <w:b/>
+                <w:bCs/>
+                <w:sz w:val="28"/>
+                <w:szCs w:val="28"/>
+              </w:rPr>
+              <w:t>ID</w:t>
+            </w:r>
+          </w:p>
+        </w:tc>
+        <w:tc>
+          <w:tcPr>
+            <w:tcW w:w="885" w:type="dxa"/>
+            <w:vAlign w:val="center"/>
+          </w:tcPr>
+          <w:p>
+            <w:pPr>
+              <w:jc w:val="center"/>
+              <w:rPr>
+                <w:rFonts w:ascii="Times New Roman" w:hAnsi="Times New Roman" w:cs="Times New Roman"/>
+                <w:b/>
+                <w:bCs/>
+                <w:sz w:val="28"/>
+                <w:szCs w:val="28"/>
+              </w:rPr>
+            </w:pPr>
+            <w:r>
+              <w:rPr>
+                <w:rFonts w:ascii="Times New Roman" w:hAnsi="Times New Roman" w:cs="Times New Roman"/>
+                <w:b/>
+                <w:bCs/>
+                <w:sz w:val="28"/>
+                <w:szCs w:val="28"/>
+              </w:rPr>
+              <w:t>Event</w:t>
+            </w:r>
+          </w:p>
+        </w:tc>
+        <w:tc>
+          <w:tcPr>
+            <w:tcW w:w="2117" w:type="dxa"/>
+            <w:vAlign w:val="center"/>
+          </w:tcPr>
+          <w:p>
+            <w:pPr>
+              <w:jc w:val="center"/>
+              <w:rPr>
+                <w:rFonts w:ascii="Times New Roman" w:hAnsi="Times New Roman" w:cs="Times New Roman"/>
+                <w:b/>
+                <w:bCs/>
+                <w:sz w:val="28"/>
+                <w:szCs w:val="28"/>
+              </w:rPr>
+            </w:pPr>
+            <w:r>
+              <w:rPr>
+                <w:rFonts w:ascii="Times New Roman" w:hAnsi="Times New Roman" w:cs="Times New Roman"/>
+                <w:b/>
+                <w:bCs/>
+                <w:sz w:val="28"/>
+                <w:szCs w:val="28"/>
+              </w:rPr>
+              <w:t>Link</w:t>
+            </w:r>
+            <w:r>
+              <w:rPr>
+                <w:rFonts w:ascii="Times New Roman" w:hAnsi="Times New Roman" w:cs="Times New Roman"/>
+                <w:b/>
+                <w:bCs/>
+                <w:sz w:val="28"/>
+                <w:szCs w:val="28"/>
+              </w:rPr>
+              <w:t xml:space="preserve"> API</w:t>
+            </w:r>
+          </w:p>
+        </w:tc>
+        <w:tc>
+          <w:tcPr>
+            <w:tcW w:w="2986" w:type="dxa"/>
+            <w:vAlign w:val="center"/>
+          </w:tcPr>
+          <w:p>
+            <w:pPr>
+              <w:jc w:val="center"/>
+              <w:rPr>
+                <w:rFonts w:ascii="Times New Roman" w:hAnsi="Times New Roman" w:cs="Times New Roman"/>
+                <w:b/>
+                <w:bCs/>
+                <w:sz w:val="28"/>
+                <w:szCs w:val="28"/>
+              </w:rPr>
+            </w:pPr>
+            <w:r>
+              <w:rPr>
+                <w:rFonts w:ascii="Times New Roman" w:hAnsi="Times New Roman" w:cs="Times New Roman"/>
+                <w:b/>
+                <w:bCs/>
+                <w:sz w:val="28"/>
+                <w:szCs w:val="28"/>
+              </w:rPr>
+              <w:t>Request</w:t>
+            </w:r>
+          </w:p>
+        </w:tc>
+        <w:tc>
+          <w:tcPr>
+            <w:tcW w:w="1681" w:type="dxa"/>
+            <w:vAlign w:val="center"/>
+          </w:tcPr>
+          <w:p>
+            <w:pPr>
+              <w:jc w:val="center"/>
+              <w:rPr>
+                <w:rFonts w:ascii="Times New Roman" w:hAnsi="Times New Roman" w:cs="Times New Roman"/>
+                <w:b/>
+                <w:bCs/>
+                <w:sz w:val="28"/>
+                <w:szCs w:val="28"/>
+              </w:rPr>
+            </w:pPr>
+            <w:r>
+              <w:rPr>
+                <w:rFonts w:ascii="Times New Roman" w:hAnsi="Times New Roman" w:cs="Times New Roman"/>
+                <w:b/>
+                <w:bCs/>
+                <w:sz w:val="28"/>
+                <w:szCs w:val="28"/>
+              </w:rPr>
+              <w:t>Response</w:t>
+            </w:r>
+          </w:p>
+        </w:tc>
+        <w:tc>
+          <w:tcPr>
+            <w:tcW w:w="1088" w:type="dxa"/>
+            <w:vAlign w:val="center"/>
+          </w:tcPr>
+          <w:p>
+            <w:pPr>
+              <w:jc w:val="center"/>
+              <w:rPr>
+                <w:rFonts w:ascii="Times New Roman" w:hAnsi="Times New Roman" w:cs="Times New Roman"/>
+                <w:b/>
+                <w:bCs/>
+                <w:sz w:val="28"/>
+                <w:szCs w:val="28"/>
+              </w:rPr>
+            </w:pPr>
+            <w:r>
+              <w:rPr>
+                <w:rFonts w:ascii="Times New Roman" w:hAnsi="Times New Roman" w:cs="Times New Roman"/>
+                <w:b/>
+                <w:bCs/>
+                <w:sz w:val="28"/>
+                <w:szCs w:val="28"/>
+              </w:rPr>
+              <w:t>Method</w:t>
+            </w:r>
+          </w:p>
+        </w:tc>
+      </w:tr>
+      <w:tr>
+        <w:tc>
+          <w:tcPr>
+            <w:tcW w:w="593" w:type="dxa"/>
+            <w:vAlign w:val="center"/>
+          </w:tcPr>
+          <w:p>
+            <w:pPr>
+              <w:jc w:val="center"/>
+              <w:rPr>
+                <w:rFonts w:ascii="Times New Roman" w:hAnsi="Times New Roman" w:cs="Times New Roman"/>
+                <w:sz w:val="28"/>
+                <w:szCs w:val="28"/>
+              </w:rPr>
+            </w:pPr>
+            <w:r>
+              <w:rPr>
+                <w:rFonts w:ascii="Times New Roman" w:hAnsi="Times New Roman" w:cs="Times New Roman"/>
+                <w:sz w:val="28"/>
+                <w:szCs w:val="28"/>
+              </w:rPr>
+              <w:t>1</w:t>
+            </w:r>
+          </w:p>
+        </w:tc>
+        <w:tc>
+          <w:tcPr>
+            <w:tcW w:w="885" w:type="dxa"/>
+            <w:vAlign w:val="center"/>
+          </w:tcPr>
+          <w:p>
+            <w:pPr>
+              <w:jc w:val="center"/>
+              <w:rPr>
+                <w:rFonts w:ascii="Times New Roman" w:hAnsi="Times New Roman" w:cs="Times New Roman"/>
+                <w:sz w:val="28"/>
+                <w:szCs w:val="28"/>
+              </w:rPr>
+            </w:pPr>
+            <w:r>
+              <w:rPr>
+                <w:rFonts w:ascii="Times New Roman" w:hAnsi="Times New Roman" w:cs="Times New Roman"/>
+                <w:sz w:val="28"/>
+                <w:szCs w:val="28"/>
+              </w:rPr>
+              <w:t>Login</w:t>
+            </w:r>
+          </w:p>
+        </w:tc>
+        <w:tc>
+          <w:tcPr>
+            <w:tcW w:w="2117" w:type="dxa"/>
+            <w:vAlign w:val="center"/>
+          </w:tcPr>
+          <w:p>
+            <w:pPr>
+              <w:rPr>
+                <w:rFonts w:ascii="Times New Roman" w:hAnsi="Times New Roman" w:cs="Times New Roman"/>
+                <w:sz w:val="28"/>
+                <w:szCs w:val="28"/>
+              </w:rPr>
+            </w:pPr>
+            <w:r>
+              <w:rPr>
+                <w:rFonts w:ascii="Times New Roman" w:hAnsi="Times New Roman" w:cs="Times New Roman"/>
+                <w:sz w:val="28"/>
+                <w:szCs w:val="28"/>
+              </w:rPr>
+              <w:t>Localhost: 44315/api/Login</w:t>
+            </w:r>
+          </w:p>
+        </w:tc>
+        <w:tc>
+          <w:tcPr>
+            <w:tcW w:w="2986" w:type="dxa"/>
+            <w:vAlign w:val="center"/>
+          </w:tcPr>
+          <w:p>
+            <w:pPr>
+              <w:rPr>
+                <w:rFonts w:ascii="Times New Roman" w:hAnsi="Times New Roman" w:cs="Times New Roman"/>
+                <w:sz w:val="28"/>
+                <w:szCs w:val="28"/>
+              </w:rPr>
+            </w:pPr>
+            <w:r>
+              <w:rPr>
+                <w:rFonts w:ascii="Times New Roman" w:hAnsi="Times New Roman" w:cs="Times New Roman"/>
+                <w:sz w:val="28"/>
+                <w:szCs w:val="28"/>
+              </w:rPr>
+              <w:t>Username</w:t>
+            </w:r>
+          </w:p>
+          <w:p>
+            <w:pPr>
+              <w:rPr>
+                <w:rFonts w:ascii="Times New Roman" w:hAnsi="Times New Roman" w:cs="Times New Roman"/>
+                <w:sz w:val="28"/>
+                <w:szCs w:val="28"/>
+              </w:rPr>
+            </w:pPr>
+            <w:r>
+              <w:rPr>
+                <w:rFonts w:ascii="Times New Roman" w:hAnsi="Times New Roman" w:cs="Times New Roman"/>
+                <w:sz w:val="28"/>
+                <w:szCs w:val="28"/>
+              </w:rPr>
+              <w:t>Pass</w:t>
+            </w:r>
+          </w:p>
+        </w:tc>
+        <w:tc>
+          <w:tcPr>
+            <w:tcW w:w="1681" w:type="dxa"/>
+            <w:vAlign w:val="center"/>
+          </w:tcPr>
+          <w:p>
+            <w:pPr>
+              <w:rPr>
+                <w:rFonts w:ascii="Times New Roman" w:hAnsi="Times New Roman" w:cs="Times New Roman"/>
+                <w:sz w:val="28"/>
+                <w:szCs w:val="28"/>
+              </w:rPr>
+            </w:pPr>
+            <w:r>
+              <w:rPr>
+                <w:rFonts w:ascii="Times New Roman" w:hAnsi="Times New Roman" w:cs="Times New Roman"/>
+                <w:sz w:val="28"/>
+                <w:szCs w:val="28"/>
+              </w:rPr>
+              <w:t>Status</w:t>
+            </w:r>
+          </w:p>
+          <w:p>
+            <w:pPr>
+              <w:rPr>
+                <w:rFonts w:ascii="Times New Roman" w:hAnsi="Times New Roman" w:cs="Times New Roman"/>
+                <w:sz w:val="28"/>
+                <w:szCs w:val="28"/>
+              </w:rPr>
+            </w:pPr>
+            <w:r>
+              <w:rPr>
+                <w:rFonts w:ascii="Times New Roman" w:hAnsi="Times New Roman" w:cs="Times New Roman"/>
+                <w:sz w:val="28"/>
+                <w:szCs w:val="28"/>
+              </w:rPr>
+              <w:t>Message</w:t>
+            </w:r>
+          </w:p>
+          <w:p>
+            <w:pPr>
+              <w:rPr>
+                <w:rFonts w:ascii="Times New Roman" w:hAnsi="Times New Roman" w:cs="Times New Roman"/>
+                <w:sz w:val="28"/>
+                <w:szCs w:val="28"/>
+              </w:rPr>
+            </w:pPr>
+            <w:r>
+              <w:rPr>
+                <w:rFonts w:ascii="Times New Roman" w:hAnsi="Times New Roman" w:cs="Times New Roman"/>
+                <w:sz w:val="28"/>
+                <w:szCs w:val="28"/>
+              </w:rPr>
+              <w:t>Token</w:t>
+            </w:r>
+            <w:r>
+              <w:rPr>
+                <w:rFonts w:ascii="Times New Roman" w:hAnsi="Times New Roman" w:cs="Times New Roman"/>
+                <w:sz w:val="28"/>
+                <w:szCs w:val="28"/>
+              </w:rPr>
+              <w:t xml:space="preserve"> </w:t>
+            </w:r>
+            <w:r>
+              <w:rPr>
+                <w:rFonts w:ascii="Times New Roman" w:hAnsi="Times New Roman" w:cs="Times New Roman"/>
+                <w:sz w:val="28"/>
+                <w:szCs w:val="28"/>
+              </w:rPr>
+              <w:t>(Nếu cần)</w:t>
+            </w:r>
+          </w:p>
+        </w:tc>
+        <w:tc>
+          <w:tcPr>
+            <w:tcW w:w="1088" w:type="dxa"/>
+            <w:vAlign w:val="center"/>
+          </w:tcPr>
+          <w:p>
+            <w:pPr>
+              <w:jc w:val="center"/>
+              <w:rPr>
+                <w:rFonts w:ascii="Times New Roman" w:hAnsi="Times New Roman" w:cs="Times New Roman"/>
+                <w:sz w:val="28"/>
+                <w:szCs w:val="28"/>
+              </w:rPr>
+            </w:pPr>
+            <w:r>
+              <w:rPr>
+                <w:rFonts w:ascii="Times New Roman" w:hAnsi="Times New Roman" w:cs="Times New Roman"/>
+                <w:sz w:val="28"/>
+                <w:szCs w:val="28"/>
+              </w:rPr>
+              <w:t>POST</w:t>
+            </w:r>
+          </w:p>
+        </w:tc>
+      </w:tr>
+      <w:tr>
+        <w:tc>
+          <w:tcPr>
+            <w:tcW w:w="593" w:type="dxa"/>
+            <w:vAlign w:val="center"/>
+          </w:tcPr>
+          <w:p>
+            <w:pPr>
+              <w:jc w:val="center"/>
+              <w:rPr>
+                <w:rFonts w:ascii="Times New Roman" w:hAnsi="Times New Roman" w:cs="Times New Roman"/>
+                <w:sz w:val="28"/>
+                <w:szCs w:val="28"/>
+              </w:rPr>
+            </w:pPr>
+            <w:r>
+              <w:rPr>
+                <w:rFonts w:ascii="Times New Roman" w:hAnsi="Times New Roman" w:cs="Times New Roman"/>
+                <w:sz w:val="28"/>
+                <w:szCs w:val="28"/>
+              </w:rPr>
+              <w:t>2</w:t>
+            </w:r>
+          </w:p>
+        </w:tc>
+        <w:tc>
+          <w:tcPr>
+            <w:tcW w:w="885" w:type="dxa"/>
+            <w:vAlign w:val="center"/>
+          </w:tcPr>
+          <w:p>
+            <w:pPr>
+              <w:jc w:val="center"/>
+              <w:rPr>
+                <w:rFonts w:ascii="Times New Roman" w:hAnsi="Times New Roman" w:cs="Times New Roman"/>
+                <w:sz w:val="28"/>
+                <w:szCs w:val="28"/>
+              </w:rPr>
+            </w:pPr>
+            <w:r>
+              <w:rPr>
+                <w:rFonts w:ascii="Times New Roman" w:hAnsi="Times New Roman" w:cs="Times New Roman"/>
+                <w:sz w:val="28"/>
+                <w:szCs w:val="28"/>
+              </w:rPr>
+              <w:t>Thêm khách hàng</w:t>
+            </w:r>
+          </w:p>
+        </w:tc>
+        <w:tc>
+          <w:tcPr>
+            <w:tcW w:w="2117" w:type="dxa"/>
+            <w:vAlign w:val="center"/>
+          </w:tcPr>
+          <w:p>
+            <w:pPr>
+              <w:rPr>
+                <w:rFonts w:ascii="Times New Roman" w:hAnsi="Times New Roman" w:cs="Times New Roman"/>
+                <w:sz w:val="28"/>
+                <w:szCs w:val="28"/>
+              </w:rPr>
+            </w:pPr>
+            <w:r>
+              <w:rPr>
+                <w:rFonts w:ascii="Times New Roman" w:hAnsi="Times New Roman" w:cs="Times New Roman"/>
+                <w:sz w:val="28"/>
+                <w:szCs w:val="28"/>
+              </w:rPr>
+              <w:t>Localhost: 44315/api/</w:t>
+            </w:r>
+            <w:r>
+              <w:rPr>
+                <w:rFonts w:ascii="Times New Roman" w:hAnsi="Times New Roman" w:cs="Times New Roman"/>
+                <w:sz w:val="28"/>
+                <w:szCs w:val="28"/>
+              </w:rPr>
+              <w:t>AddCustomer</w:t>
+            </w:r>
+          </w:p>
+        </w:tc>
+        <w:tc>
+          <w:tcPr>
+            <w:tcW w:w="2986" w:type="dxa"/>
+            <w:vAlign w:val="center"/>
+          </w:tcPr>
+          <w:p>
+            <w:pPr>
+              <w:rPr>
+                <w:rFonts w:ascii="Times New Roman" w:hAnsi="Times New Roman" w:cs="Times New Roman"/>
+                <w:sz w:val="28"/>
+                <w:szCs w:val="28"/>
+              </w:rPr>
+            </w:pPr>
+            <w:r>
+              <w:rPr>
+                <w:rFonts w:ascii="Times New Roman" w:hAnsi="Times New Roman" w:cs="Times New Roman"/>
+                <w:sz w:val="28"/>
+                <w:szCs w:val="28"/>
+              </w:rPr>
+              <w:t>Customer name</w:t>
+            </w:r>
+          </w:p>
+          <w:p>
+            <w:pPr>
+              <w:rPr>
+                <w:rFonts w:ascii="Times New Roman" w:hAnsi="Times New Roman" w:cs="Times New Roman"/>
+                <w:sz w:val="28"/>
+                <w:szCs w:val="28"/>
+              </w:rPr>
+            </w:pPr>
+            <w:r>
+              <w:rPr>
+                <w:rFonts w:ascii="Times New Roman" w:hAnsi="Times New Roman" w:cs="Times New Roman"/>
+                <w:sz w:val="28"/>
+                <w:szCs w:val="28"/>
+              </w:rPr>
+              <w:t>Birhday</w:t>
+            </w:r>
+          </w:p>
+          <w:p>
+            <w:pPr>
+              <w:rPr>
+                <w:rFonts w:ascii="Times New Roman" w:hAnsi="Times New Roman" w:cs="Times New Roman"/>
+                <w:sz w:val="28"/>
+                <w:szCs w:val="28"/>
+              </w:rPr>
+            </w:pPr>
+            <w:r>
+              <w:rPr>
+                <w:rFonts w:ascii="Times New Roman" w:hAnsi="Times New Roman" w:cs="Times New Roman"/>
+                <w:sz w:val="28"/>
+                <w:szCs w:val="28"/>
+              </w:rPr>
+              <w:t>Gender</w:t>
+            </w:r>
+          </w:p>
+          <w:p>
+            <w:pPr>
+              <w:rPr>
+                <w:rFonts w:ascii="Times New Roman" w:hAnsi="Times New Roman" w:cs="Times New Roman"/>
+                <w:sz w:val="28"/>
+                <w:szCs w:val="28"/>
+              </w:rPr>
+            </w:pPr>
+            <w:r>
+              <w:rPr>
+                <w:rFonts w:ascii="Times New Roman" w:hAnsi="Times New Roman" w:cs="Times New Roman"/>
+                <w:sz w:val="28"/>
+                <w:szCs w:val="28"/>
+              </w:rPr>
+              <w:t>Link image</w:t>
+            </w:r>
+          </w:p>
+          <w:p>
+            <w:pPr>
+              <w:rPr>
+                <w:rFonts w:ascii="Times New Roman" w:hAnsi="Times New Roman" w:cs="Times New Roman"/>
+                <w:sz w:val="28"/>
+                <w:szCs w:val="28"/>
+              </w:rPr>
+            </w:pPr>
+            <w:r>
+              <w:rPr>
+                <w:rFonts w:ascii="Times New Roman" w:hAnsi="Times New Roman" w:cs="Times New Roman"/>
+                <w:sz w:val="28"/>
+                <w:szCs w:val="28"/>
+              </w:rPr>
+              <w:t>Address</w:t>
+            </w:r>
+          </w:p>
+        </w:tc>
+        <w:tc>
+          <w:tcPr>
+            <w:tcW w:w="1681" w:type="dxa"/>
+            <w:vAlign w:val="center"/>
+          </w:tcPr>
+          <w:p>
+            <w:pPr>
+              <w:rPr>
+                <w:rFonts w:ascii="Times New Roman" w:hAnsi="Times New Roman" w:cs="Times New Roman"/>
+                <w:sz w:val="28"/>
+                <w:szCs w:val="28"/>
+              </w:rPr>
+            </w:pPr>
+            <w:r>
+              <w:rPr>
+                <w:rFonts w:ascii="Times New Roman" w:hAnsi="Times New Roman" w:cs="Times New Roman"/>
+                <w:sz w:val="28"/>
+                <w:szCs w:val="28"/>
+              </w:rPr>
+              <w:t>Status</w:t>
+            </w:r>
+          </w:p>
+          <w:p>
+            <w:pPr>
+              <w:rPr>
+                <w:rFonts w:ascii="Times New Roman" w:hAnsi="Times New Roman" w:cs="Times New Roman"/>
+                <w:sz w:val="28"/>
+                <w:szCs w:val="28"/>
+              </w:rPr>
+            </w:pPr>
+            <w:r>
+              <w:rPr>
+                <w:rFonts w:ascii="Times New Roman" w:hAnsi="Times New Roman" w:cs="Times New Roman"/>
+                <w:sz w:val="28"/>
+                <w:szCs w:val="28"/>
+              </w:rPr>
+              <w:t>Message</w:t>
+            </w:r>
+          </w:p>
+          <w:p>
+            <w:pPr>
+              <w:rPr>
+                <w:rFonts w:ascii="Times New Roman" w:hAnsi="Times New Roman" w:cs="Times New Roman"/>
+                <w:sz w:val="28"/>
+                <w:szCs w:val="28"/>
+              </w:rPr>
+            </w:pPr>
+          </w:p>
+        </w:tc>
+        <w:tc>
+          <w:tcPr>
+            <w:tcW w:w="1088" w:type="dxa"/>
+            <w:vAlign w:val="center"/>
+          </w:tcPr>
+          <w:p>
+            <w:pPr>
+              <w:jc w:val="center"/>
+              <w:rPr>
+                <w:rFonts w:ascii="Times New Roman" w:hAnsi="Times New Roman" w:cs="Times New Roman"/>
+                <w:sz w:val="28"/>
+                <w:szCs w:val="28"/>
+              </w:rPr>
+            </w:pPr>
+            <w:r>
+              <w:rPr>
+                <w:rFonts w:ascii="Times New Roman" w:hAnsi="Times New Roman" w:cs="Times New Roman"/>
+                <w:sz w:val="28"/>
+                <w:szCs w:val="28"/>
+              </w:rPr>
+              <w:t>POST</w:t>
+            </w:r>
+          </w:p>
+        </w:tc>
+      </w:tr>
+      <w:tr>
+        <w:tc>
+          <w:tcPr>
+            <w:tcW w:w="593" w:type="dxa"/>
+            <w:vAlign w:val="center"/>
+          </w:tcPr>
+          <w:p>
+            <w:pPr>
+              <w:jc w:val="center"/>
+              <w:rPr>
+                <w:rFonts w:ascii="Times New Roman" w:hAnsi="Times New Roman" w:cs="Times New Roman"/>
+                <w:sz w:val="28"/>
+                <w:szCs w:val="28"/>
+              </w:rPr>
+            </w:pPr>
+          </w:p>
+        </w:tc>
+        <w:tc>
+          <w:tcPr>
+            <w:tcW w:w="885" w:type="dxa"/>
+            <w:vAlign w:val="center"/>
+          </w:tcPr>
+          <w:p>
+            <w:pPr>
+              <w:jc w:val="center"/>
+              <w:rPr>
+                <w:rFonts w:ascii="Times New Roman" w:hAnsi="Times New Roman" w:cs="Times New Roman"/>
+                <w:sz w:val="28"/>
+                <w:szCs w:val="28"/>
+              </w:rPr>
+            </w:pPr>
+          </w:p>
+        </w:tc>
+        <w:tc>
+          <w:tcPr>
+            <w:tcW w:w="2117" w:type="dxa"/>
+            <w:vAlign w:val="center"/>
+          </w:tcPr>
+          <w:p>
+            <w:pPr>
+              <w:rPr>
+                <w:rFonts w:ascii="Times New Roman" w:hAnsi="Times New Roman" w:cs="Times New Roman"/>
+                <w:sz w:val="28"/>
+                <w:szCs w:val="28"/>
+              </w:rPr>
+            </w:pPr>
+          </w:p>
+        </w:tc>
+        <w:tc>
+          <w:tcPr>
+            <w:tcW w:w="2986" w:type="dxa"/>
+            <w:vAlign w:val="center"/>
+          </w:tcPr>
+          <w:p>
+            <w:pPr>
+              <w:rPr>
+                <w:rFonts w:ascii="Times New Roman" w:hAnsi="Times New Roman" w:cs="Times New Roman"/>
+                <w:sz w:val="28"/>
+                <w:szCs w:val="28"/>
+              </w:rPr>
+            </w:pPr>
+          </w:p>
+        </w:tc>
+        <w:tc>
+          <w:tcPr>
+            <w:tcW w:w="1681" w:type="dxa"/>
+            <w:vAlign w:val="center"/>
+          </w:tcPr>
+          <w:p>
+            <w:pPr>
+              <w:rPr>
+                <w:rFonts w:ascii="Times New Roman" w:hAnsi="Times New Roman" w:cs="Times New Roman"/>
+                <w:sz w:val="28"/>
+                <w:szCs w:val="28"/>
+              </w:rPr>
+            </w:pPr>
+          </w:p>
+        </w:tc>
+        <w:tc>
+          <w:tcPr>
+            <w:tcW w:w="1088" w:type="dxa"/>
+          </w:tcPr>
+          <w:p>
+            <w:pPr>
+              <w:rPr>
+                <w:rFonts w:ascii="Times New Roman" w:hAnsi="Times New Roman" w:cs="Times New Roman"/>
+                <w:sz w:val="28"/>
+                <w:szCs w:val="28"/>
+              </w:rPr>
+            </w:pPr>
+          </w:p>
+        </w:tc>
+      </w:tr>
+    </w:tbl>
+    <w:p>
+      <w:pPr>
+        <w:jc w:val="both"/>
+        <w:rPr>
+          <w:rFonts w:ascii="Times New Roman" w:hAnsi="Times New Roman" w:cs="Times New Roman"/>
+          <w:sz w:val="28"/>
+          <w:szCs w:val="28"/>
+        </w:rPr>
+      </w:pPr>
+      <w:r>
+        <w:rPr>
+          <w:rFonts w:ascii="Times New Roman" w:hAnsi="Times New Roman" w:cs="Times New Roman"/>
+          <w:sz w:val="28"/>
+          <w:szCs w:val="28"/>
+        </w:rPr>
+        <w:tab/>
+      </w:r>
+    </w:p>
+    <w:p>
+      <w:pPr>
+        <w:jc w:val="both"/>
+        <w:rPr>
+          <w:rFonts w:ascii="Times New Roman" w:hAnsi="Times New Roman" w:cs="Times New Roman"/>
+          <w:sz w:val="28"/>
+          <w:szCs w:val="28"/>
+        </w:rPr>
+      </w:pPr>
+      <w:r>
+        <w:rPr>
+          <w:rFonts w:ascii="Times New Roman" w:hAnsi="Times New Roman" w:cs="Times New Roman"/>
+          <w:sz w:val="28"/>
+          <w:szCs w:val="28"/>
+        </w:rPr>
+        <w:t>Cài đặt:</w:t>
+      </w:r>
+    </w:p>
+    <w:p>
+      <w:pPr>
+        <w:jc w:val="both"/>
+        <w:rPr>
+          <w:rFonts w:ascii="Times New Roman" w:hAnsi="Times New Roman" w:cs="Times New Roman"/>
+          <w:sz w:val="28"/>
+          <w:szCs w:val="28"/>
+        </w:rPr>
+      </w:pPr>
+    </w:p>
+    <w:p>
+      <w:pPr>
+        <w:jc w:val="both"/>
+        <w:rPr>
+          <w:rFonts w:ascii="Times New Roman" w:hAnsi="Times New Roman" w:cs="Times New Roman"/>
+          <w:sz w:val="28"/>
+          <w:szCs w:val="28"/>
+        </w:rPr>
+      </w:pPr>
+      <w:r>
+        <w:rPr>
+          <w:rFonts w:ascii="Times New Roman" w:hAnsi="Times New Roman" w:cs="Times New Roman"/>
+          <w:sz w:val="28"/>
+          <w:szCs w:val="28"/>
+        </w:rPr>
+        <w:t>Công cụ sử dụng:</w:t>
+      </w:r>
+    </w:p>
+    <w:p>
+      <w:pPr>
+        <w:jc w:val="both"/>
+        <w:rPr>
+          <w:rFonts w:ascii="Times New Roman" w:hAnsi="Times New Roman" w:cs="Times New Roman"/>
+          <w:sz w:val="28"/>
+          <w:szCs w:val="28"/>
+        </w:rPr>
+      </w:pPr>
+      <w:r>
+        <w:rPr>
+          <w:rFonts w:ascii="Times New Roman" w:hAnsi="Times New Roman" w:cs="Times New Roman"/>
+          <w:sz w:val="28"/>
+          <w:szCs w:val="28"/>
+        </w:rPr>
+        <w:t>Visual studio code, Visual code, Sql Server</w:t>
+      </w:r>
+    </w:p>
+    <w:p>
+      <w:pPr>
+        <w:jc w:val="both"/>
+        <w:rPr>
+          <w:rFonts w:ascii="Times New Roman" w:hAnsi="Times New Roman" w:cs="Times New Roman"/>
+          <w:sz w:val="28"/>
+          <w:szCs w:val="28"/>
+        </w:rPr>
+      </w:pPr>
+      <w:r>
+        <w:rPr>
+          <w:rFonts w:ascii="Times New Roman" w:hAnsi="Times New Roman" w:cs="Times New Roman"/>
+          <w:sz w:val="28"/>
+          <w:szCs w:val="28"/>
+        </w:rPr>
+        <w:t>Frameword: ReactTS, C# ASP .NET Core</w:t>
+      </w:r>
     </w:p>
     <w:p>
       <w:pPr>
@@ -1187,6 +2244,7 @@
   <w:style w:type="paragraph" w:default="1" w:styleId="Normal">
     <w:name w:val="Normal"/>
     <w:qFormat/>
+    <w:rsid w:val="008457B7"/>
   </w:style>
   <w:style w:type="paragraph" w:styleId="Heading1">
     <w:name w:val="heading 1"/>
@@ -1703,6 +2761,25 @@
       <w:color w:val="2F5496" w:themeColor="accent1" w:themeShade="BF"/>
       <w:spacing w:val="5"/>
     </w:rPr>
+  </w:style>
+  <w:style w:type="table" w:styleId="TableGrid">
+    <w:name w:val="Table Grid"/>
+    <w:basedOn w:val="TableNormal"/>
+    <w:uiPriority w:val="39"/>
+    <w:rsid w:val="008457B7"/>
+    <w:pPr>
+      <w:spacing w:after="0" w:line="240" w:lineRule="auto"/>
+    </w:pPr>
+    <w:tblPr>
+      <w:tblBorders>
+        <w:top w:val="single" w:sz="4" w:space="0" w:color="auto"/>
+        <w:left w:val="single" w:sz="4" w:space="0" w:color="auto"/>
+        <w:bottom w:val="single" w:sz="4" w:space="0" w:color="auto"/>
+        <w:right w:val="single" w:sz="4" w:space="0" w:color="auto"/>
+        <w:insideH w:val="single" w:sz="4" w:space="0" w:color="auto"/>
+        <w:insideV w:val="single" w:sz="4" w:space="0" w:color="auto"/>
+      </w:tblBorders>
+    </w:tblPr>
   </w:style>
 </w:styles>
 </file>

</xml_diff>

<commit_message>
Không thêm gì mới
</commit_message>
<xml_diff>
--- a/Hệ thống nhà sách.docx
+++ b/Hệ thống nhà sách.docx
@@ -716,7 +716,23 @@
           <w:sz w:val="28"/>
           <w:szCs w:val="28"/>
         </w:rPr>
-        <w:t>Xử lý đơn hàng: Login -&gt; Thêm đơn hàng -&gt; Chọn sản phẩm -&gt; Thêm vào giỏ hàng -&gt; Thêm thành viên nhà sách (Nếu có) -&gt; Thanh toán -&gt; Kết thúc.</w:t>
+        <w:t>Xử lý đơn hàng: Login -&gt;</w:t>
+      </w:r>
+      <w:r>
+        <w:rPr>
+          <w:rFonts w:ascii="Times New Roman" w:hAnsi="Times New Roman" w:cs="Times New Roman"/>
+          <w:sz w:val="28"/>
+          <w:szCs w:val="28"/>
+        </w:rPr>
+        <w:t>Quản lý đơn hàng -&gt;</w:t>
+      </w:r>
+      <w:r>
+        <w:rPr>
+          <w:rFonts w:ascii="Times New Roman" w:hAnsi="Times New Roman" w:cs="Times New Roman"/>
+          <w:sz w:val="28"/>
+          <w:szCs w:val="28"/>
+        </w:rPr>
+        <w:t xml:space="preserve"> Thêm đơn hàng -&gt; Chọn sản phẩm -&gt; Thêm vào giỏ hàng -&gt; Thêm thành viên nhà sách (Nếu có) -&gt; Thanh toán -&gt; Kết thúc.</w:t>
       </w:r>
     </w:p>
     <w:p>
@@ -1325,15 +1341,7 @@
                 <w:sz w:val="28"/>
                 <w:szCs w:val="28"/>
               </w:rPr>
-              <w:t>Localhost: 44315/api/</w:t>
-            </w:r>
-            <w:r>
-              <w:rPr>
-                <w:rFonts w:ascii="Times New Roman" w:hAnsi="Times New Roman" w:cs="Times New Roman"/>
-                <w:sz w:val="28"/>
-                <w:szCs w:val="28"/>
-              </w:rPr>
-              <w:t>AddCustomer</w:t>
+              <w:t>Localhost: 44315/api/AddCustomer</w:t>
             </w:r>
           </w:p>
         </w:tc>

</xml_diff>

<commit_message>
nay chỉ làm tới đây thôi
</commit_message>
<xml_diff>
--- a/Hệ thống nhà sách.docx
+++ b/Hệ thống nhà sách.docx
@@ -848,6 +848,25 @@
           <w:szCs w:val="28"/>
         </w:rPr>
         <w:t>Thêm/ Sửa nhân viên: Login -&gt; Quản lý nhân viên -&gt; Thêm/ Sửa nhân viên -&gt; Thêm/ Sửa nhân viên -&gt; Kết thúc.</w:t>
+      </w:r>
+    </w:p>
+    <w:p>
+      <w:pPr>
+        <w:ind w:firstLine="720"/>
+        <w:jc w:val="both"/>
+        <w:rPr>
+          <w:rFonts w:ascii="Times New Roman" w:hAnsi="Times New Roman" w:cs="Times New Roman"/>
+          <w:sz w:val="28"/>
+          <w:szCs w:val="28"/>
+        </w:rPr>
+      </w:pPr>
+      <w:r>
+        <w:rPr>
+          <w:rFonts w:ascii="Times New Roman" w:hAnsi="Times New Roman" w:cs="Times New Roman"/>
+          <w:sz w:val="28"/>
+          <w:szCs w:val="28"/>
+        </w:rPr>
+        <w:t>Báo cáo thống kê Login -&gt; Dashboard -&gt; Chi tiết báo cáo -&gt; Xuất báo cáo -&gt; Kết thúc.</w:t>
       </w:r>
     </w:p>
     <w:p>
@@ -1631,6 +1650,16 @@
           <w:szCs w:val="28"/>
         </w:rPr>
       </w:pPr>
+    </w:p>
+    <w:p>
+      <w:pPr>
+        <w:jc w:val="both"/>
+        <w:rPr>
+          <w:rFonts w:ascii="Times New Roman" w:hAnsi="Times New Roman" w:cs="Times New Roman"/>
+          <w:sz w:val="28"/>
+          <w:szCs w:val="28"/>
+        </w:rPr>
+      </w:pPr>
       <w:r>
         <w:rPr>
           <w:rFonts w:ascii="Times New Roman" w:hAnsi="Times New Roman" w:cs="Times New Roman"/>
@@ -1642,13 +1671,64 @@
     </w:p>
     <w:p>
       <w:pPr>
-        <w:jc w:val="both"/>
-        <w:rPr>
-          <w:rFonts w:ascii="Times New Roman" w:hAnsi="Times New Roman" w:cs="Times New Roman"/>
-          <w:sz w:val="28"/>
-          <w:szCs w:val="28"/>
-        </w:rPr>
-      </w:pPr>
+        <w:pStyle w:val="ListParagraph"/>
+        <w:numPr>
+          <w:ilvl w:val="0"/>
+          <w:numId w:val="3"/>
+        </w:numPr>
+        <w:jc w:val="both"/>
+        <w:rPr>
+          <w:rFonts w:ascii="Times New Roman" w:hAnsi="Times New Roman" w:cs="Times New Roman"/>
+          <w:sz w:val="28"/>
+          <w:szCs w:val="28"/>
+        </w:rPr>
+      </w:pPr>
+      <w:r>
+        <w:rPr>
+          <w:rFonts w:ascii="Times New Roman" w:hAnsi="Times New Roman" w:cs="Times New Roman"/>
+          <w:sz w:val="28"/>
+          <w:szCs w:val="28"/>
+        </w:rPr>
+        <w:t xml:space="preserve">Chức năng thêm đơn đặt hàng </w:t>
+      </w:r>
+    </w:p>
+    <w:p>
+      <w:pPr>
+        <w:ind w:left="360"/>
+        <w:jc w:val="both"/>
+        <w:rPr>
+          <w:rFonts w:ascii="Times New Roman" w:hAnsi="Times New Roman" w:cs="Times New Roman"/>
+          <w:sz w:val="28"/>
+          <w:szCs w:val="28"/>
+        </w:rPr>
+      </w:pPr>
+      <w:r>
+        <w:rPr>
+          <w:rFonts w:ascii="Times New Roman" w:hAnsi="Times New Roman" w:cs="Times New Roman"/>
+          <w:sz w:val="28"/>
+          <w:szCs w:val="28"/>
+        </w:rPr>
+        <w:t>Đầu vào: Mã đơn hàng (Sinh tự động), Thông tin sản phẩm, số lượng, đơn giá, thành tiền, Tên khách hàng (lấy từ bảng khách hàng), Tên nhân viên (lấy từ bảng nhân viên), phương thức thanh toán (lấy từ bảng thanh toán)</w:t>
+      </w:r>
+    </w:p>
+    <w:p>
+      <w:pPr>
+        <w:ind w:left="360"/>
+        <w:jc w:val="both"/>
+        <w:rPr>
+          <w:rFonts w:ascii="Times New Roman" w:hAnsi="Times New Roman" w:cs="Times New Roman"/>
+          <w:sz w:val="28"/>
+          <w:szCs w:val="28"/>
+        </w:rPr>
+      </w:pPr>
+      <w:r>
+        <w:rPr>
+          <w:rFonts w:ascii="Times New Roman" w:hAnsi="Times New Roman" w:cs="Times New Roman"/>
+          <w:sz w:val="28"/>
+          <w:szCs w:val="28"/>
+        </w:rPr>
+        <w:t xml:space="preserve">Đầu ra: status (1,0); messages: “Thành công”/ “Lỗi:” + tên lỗi)s  </w:t>
+      </w:r>
     </w:p>
     <w:p>
       <w:pPr>
@@ -1683,6 +1763,7 @@
           <w:sz w:val="28"/>
           <w:szCs w:val="28"/>
         </w:rPr>
+        <w:lastRenderedPageBreak/>
         <w:t>Visual studio code, Visual code, Sql Server</w:t>
       </w:r>
     </w:p>
@@ -1758,6 +1839,95 @@
 <file path=word/numbering.xml><?xml version="1.0" encoding="utf-8"?>
 <w:numbering xmlns:wpc="http://schemas.microsoft.com/office/word/2010/wordprocessingCanvas" xmlns:cx="http://schemas.microsoft.com/office/drawing/2014/chartex" xmlns:cx1="http://schemas.microsoft.com/office/drawing/2015/9/8/chartex" xmlns:cx2="http://schemas.microsoft.com/office/drawing/2015/10/21/chartex" xmlns:cx3="http://schemas.microsoft.com/office/drawing/2016/5/9/chartex" xmlns:cx4="http://schemas.microsoft.com/office/drawing/2016/5/10/chartex" xmlns:cx5="http://schemas.microsoft.com/office/drawing/2016/5/11/chartex" xmlns:cx6="http://schemas.microsoft.com/office/drawing/2016/5/12/chartex" xmlns:cx7="http://schemas.microsoft.com/office/drawing/2016/5/13/chartex" xmlns:cx8="http://schemas.microsoft.com/office/drawing/2016/5/14/chartex" xmlns:mc="http://schemas.openxmlformats.org/markup-compatibility/2006" xmlns:aink="http://schemas.microsoft.com/office/drawing/2016/ink" xmlns:am3d="http://schemas.microsoft.com/office/drawing/2017/model3d" xmlns:o="urn:schemas-microsoft-com:office:office" xmlns:oel="http://schemas.microsoft.com/office/2019/extlst" xmlns:r="http://schemas.openxmlformats.org/officeDocument/2006/relationships" xmlns:m="http://schemas.openxmlformats.org/officeDocument/2006/math" xmlns:v="urn:schemas-microsoft-com:vml" xmlns:wp14="http://schemas.microsoft.com/office/word/2010/wordprocessingDrawing" xmlns:wp="http://schemas.openxmlformats.org/drawingml/2006/wordprocessingDrawing" xmlns:w10="urn:schemas-microsoft-com:office:word" xmlns:w="http://schemas.openxmlformats.org/wordprocessingml/2006/main" xmlns:w14="http://schemas.microsoft.com/office/word/2010/wordml" xmlns:w15="http://schemas.microsoft.com/office/word/2012/wordml" xmlns:w16cex="http://schemas.microsoft.com/office/word/2018/wordml/cex" xmlns:w16cid="http://schemas.microsoft.com/office/word/2016/wordml/cid" xmlns:w16="http://schemas.microsoft.com/office/word/2018/wordml" xmlns:w16du="http://schemas.microsoft.com/office/word/2023/wordml/word16du" xmlns:w16sdtdh="http://schemas.microsoft.com/office/word/2020/wordml/sdtdatahash" xmlns:w16sdtfl="http://schemas.microsoft.com/office/word/2024/wordml/sdtformatlock" xmlns:w16se="http://schemas.microsoft.com/office/word/2015/wordml/symex" xmlns:wpg="http://schemas.microsoft.com/office/word/2010/wordprocessingGroup" xmlns:wpi="http://schemas.microsoft.com/office/word/2010/wordprocessingInk" xmlns:wne="http://schemas.microsoft.com/office/word/2006/wordml" xmlns:wps="http://schemas.microsoft.com/office/word/2010/wordprocessingShape" mc:Ignorable="w14 w15 w16se w16cid w16 w16cex w16sdtdh w16sdtfl w16du wp14">
   <w:abstractNum w:abstractNumId="0" w15:restartNumberingAfterBreak="0">
+    <w:nsid w:val="1C2C6A88"/>
+    <w:multiLevelType w:val="hybridMultilevel"/>
+    <w:tmpl w:val="BC76787C"/>
+    <w:lvl w:ilvl="0" w:tplc="0409000F">
+      <w:start w:val="1"/>
+      <w:numFmt w:val="decimal"/>
+      <w:lvlText w:val="%1."/>
+      <w:lvlJc w:val="left"/>
+      <w:pPr>
+        <w:ind w:left="720" w:hanging="360"/>
+      </w:pPr>
+      <w:rPr>
+        <w:rFonts w:hint="default"/>
+      </w:rPr>
+    </w:lvl>
+    <w:lvl w:ilvl="1" w:tplc="04090019" w:tentative="1">
+      <w:start w:val="1"/>
+      <w:numFmt w:val="lowerLetter"/>
+      <w:lvlText w:val="%2."/>
+      <w:lvlJc w:val="left"/>
+      <w:pPr>
+        <w:ind w:left="1440" w:hanging="360"/>
+      </w:pPr>
+    </w:lvl>
+    <w:lvl w:ilvl="2" w:tplc="0409001B" w:tentative="1">
+      <w:start w:val="1"/>
+      <w:numFmt w:val="lowerRoman"/>
+      <w:lvlText w:val="%3."/>
+      <w:lvlJc w:val="right"/>
+      <w:pPr>
+        <w:ind w:left="2160" w:hanging="180"/>
+      </w:pPr>
+    </w:lvl>
+    <w:lvl w:ilvl="3" w:tplc="0409000F" w:tentative="1">
+      <w:start w:val="1"/>
+      <w:numFmt w:val="decimal"/>
+      <w:lvlText w:val="%4."/>
+      <w:lvlJc w:val="left"/>
+      <w:pPr>
+        <w:ind w:left="2880" w:hanging="360"/>
+      </w:pPr>
+    </w:lvl>
+    <w:lvl w:ilvl="4" w:tplc="04090019" w:tentative="1">
+      <w:start w:val="1"/>
+      <w:numFmt w:val="lowerLetter"/>
+      <w:lvlText w:val="%5."/>
+      <w:lvlJc w:val="left"/>
+      <w:pPr>
+        <w:ind w:left="3600" w:hanging="360"/>
+      </w:pPr>
+    </w:lvl>
+    <w:lvl w:ilvl="5" w:tplc="0409001B" w:tentative="1">
+      <w:start w:val="1"/>
+      <w:numFmt w:val="lowerRoman"/>
+      <w:lvlText w:val="%6."/>
+      <w:lvlJc w:val="right"/>
+      <w:pPr>
+        <w:ind w:left="4320" w:hanging="180"/>
+      </w:pPr>
+    </w:lvl>
+    <w:lvl w:ilvl="6" w:tplc="0409000F" w:tentative="1">
+      <w:start w:val="1"/>
+      <w:numFmt w:val="decimal"/>
+      <w:lvlText w:val="%7."/>
+      <w:lvlJc w:val="left"/>
+      <w:pPr>
+        <w:ind w:left="5040" w:hanging="360"/>
+      </w:pPr>
+    </w:lvl>
+    <w:lvl w:ilvl="7" w:tplc="04090019" w:tentative="1">
+      <w:start w:val="1"/>
+      <w:numFmt w:val="lowerLetter"/>
+      <w:lvlText w:val="%8."/>
+      <w:lvlJc w:val="left"/>
+      <w:pPr>
+        <w:ind w:left="5760" w:hanging="360"/>
+      </w:pPr>
+    </w:lvl>
+    <w:lvl w:ilvl="8" w:tplc="0409001B" w:tentative="1">
+      <w:start w:val="1"/>
+      <w:numFmt w:val="lowerRoman"/>
+      <w:lvlText w:val="%9."/>
+      <w:lvlJc w:val="right"/>
+      <w:pPr>
+        <w:ind w:left="6480" w:hanging="180"/>
+      </w:pPr>
+    </w:lvl>
+  </w:abstractNum>
+  <w:abstractNum w:abstractNumId="1" w15:restartNumberingAfterBreak="0">
     <w:nsid w:val="4D6740AA"/>
     <w:multiLevelType w:val="hybridMultilevel"/>
     <w:tmpl w:val="EE8052D4"/>
@@ -1846,8 +2016,219 @@
       </w:pPr>
     </w:lvl>
   </w:abstractNum>
+  <w:abstractNum w:abstractNumId="2" w15:restartNumberingAfterBreak="0">
+    <w:nsid w:val="6E8818F6"/>
+    <w:multiLevelType w:val="hybridMultilevel"/>
+    <w:tmpl w:val="9B14E3FA"/>
+    <w:lvl w:ilvl="0" w:tplc="0409000F">
+      <w:start w:val="1"/>
+      <w:numFmt w:val="decimal"/>
+      <w:lvlText w:val="%1."/>
+      <w:lvlJc w:val="left"/>
+      <w:pPr>
+        <w:ind w:left="720" w:hanging="360"/>
+      </w:pPr>
+      <w:rPr>
+        <w:rFonts w:hint="default"/>
+      </w:rPr>
+    </w:lvl>
+    <w:lvl w:ilvl="1" w:tplc="04090019" w:tentative="1">
+      <w:start w:val="1"/>
+      <w:numFmt w:val="lowerLetter"/>
+      <w:lvlText w:val="%2."/>
+      <w:lvlJc w:val="left"/>
+      <w:pPr>
+        <w:ind w:left="1440" w:hanging="360"/>
+      </w:pPr>
+    </w:lvl>
+    <w:lvl w:ilvl="2" w:tplc="0409001B" w:tentative="1">
+      <w:start w:val="1"/>
+      <w:numFmt w:val="lowerRoman"/>
+      <w:lvlText w:val="%3."/>
+      <w:lvlJc w:val="right"/>
+      <w:pPr>
+        <w:ind w:left="2160" w:hanging="180"/>
+      </w:pPr>
+    </w:lvl>
+    <w:lvl w:ilvl="3" w:tplc="0409000F" w:tentative="1">
+      <w:start w:val="1"/>
+      <w:numFmt w:val="decimal"/>
+      <w:lvlText w:val="%4."/>
+      <w:lvlJc w:val="left"/>
+      <w:pPr>
+        <w:ind w:left="2880" w:hanging="360"/>
+      </w:pPr>
+    </w:lvl>
+    <w:lvl w:ilvl="4" w:tplc="04090019" w:tentative="1">
+      <w:start w:val="1"/>
+      <w:numFmt w:val="lowerLetter"/>
+      <w:lvlText w:val="%5."/>
+      <w:lvlJc w:val="left"/>
+      <w:pPr>
+        <w:ind w:left="3600" w:hanging="360"/>
+      </w:pPr>
+    </w:lvl>
+    <w:lvl w:ilvl="5" w:tplc="0409001B" w:tentative="1">
+      <w:start w:val="1"/>
+      <w:numFmt w:val="lowerRoman"/>
+      <w:lvlText w:val="%6."/>
+      <w:lvlJc w:val="right"/>
+      <w:pPr>
+        <w:ind w:left="4320" w:hanging="180"/>
+      </w:pPr>
+    </w:lvl>
+    <w:lvl w:ilvl="6" w:tplc="0409000F" w:tentative="1">
+      <w:start w:val="1"/>
+      <w:numFmt w:val="decimal"/>
+      <w:lvlText w:val="%7."/>
+      <w:lvlJc w:val="left"/>
+      <w:pPr>
+        <w:ind w:left="5040" w:hanging="360"/>
+      </w:pPr>
+    </w:lvl>
+    <w:lvl w:ilvl="7" w:tplc="04090019" w:tentative="1">
+      <w:start w:val="1"/>
+      <w:numFmt w:val="lowerLetter"/>
+      <w:lvlText w:val="%8."/>
+      <w:lvlJc w:val="left"/>
+      <w:pPr>
+        <w:ind w:left="5760" w:hanging="360"/>
+      </w:pPr>
+    </w:lvl>
+    <w:lvl w:ilvl="8" w:tplc="0409001B" w:tentative="1">
+      <w:start w:val="1"/>
+      <w:numFmt w:val="lowerRoman"/>
+      <w:lvlText w:val="%9."/>
+      <w:lvlJc w:val="right"/>
+      <w:pPr>
+        <w:ind w:left="6480" w:hanging="180"/>
+      </w:pPr>
+    </w:lvl>
+  </w:abstractNum>
+  <w:abstractNum w:abstractNumId="3" w15:restartNumberingAfterBreak="0">
+    <w:nsid w:val="6EDA039D"/>
+    <w:multiLevelType w:val="hybridMultilevel"/>
+    <w:tmpl w:val="97480EC6"/>
+    <w:lvl w:ilvl="0" w:tplc="7D22EFDE">
+      <w:start w:val="1"/>
+      <w:numFmt w:val="bullet"/>
+      <w:lvlText w:val="-"/>
+      <w:lvlJc w:val="left"/>
+      <w:pPr>
+        <w:ind w:left="720" w:hanging="360"/>
+      </w:pPr>
+      <w:rPr>
+        <w:rFonts w:ascii="Times New Roman" w:eastAsiaTheme="minorHAnsi" w:hAnsi="Times New Roman" w:cs="Times New Roman" w:hint="default"/>
+      </w:rPr>
+    </w:lvl>
+    <w:lvl w:ilvl="1" w:tplc="04090003" w:tentative="1">
+      <w:start w:val="1"/>
+      <w:numFmt w:val="bullet"/>
+      <w:lvlText w:val="o"/>
+      <w:lvlJc w:val="left"/>
+      <w:pPr>
+        <w:ind w:left="1440" w:hanging="360"/>
+      </w:pPr>
+      <w:rPr>
+        <w:rFonts w:ascii="Courier New" w:hAnsi="Courier New" w:cs="Courier New" w:hint="default"/>
+      </w:rPr>
+    </w:lvl>
+    <w:lvl w:ilvl="2" w:tplc="04090005" w:tentative="1">
+      <w:start w:val="1"/>
+      <w:numFmt w:val="bullet"/>
+      <w:lvlText w:val=""/>
+      <w:lvlJc w:val="left"/>
+      <w:pPr>
+        <w:ind w:left="2160" w:hanging="360"/>
+      </w:pPr>
+      <w:rPr>
+        <w:rFonts w:ascii="Wingdings" w:hAnsi="Wingdings" w:hint="default"/>
+      </w:rPr>
+    </w:lvl>
+    <w:lvl w:ilvl="3" w:tplc="04090001" w:tentative="1">
+      <w:start w:val="1"/>
+      <w:numFmt w:val="bullet"/>
+      <w:lvlText w:val=""/>
+      <w:lvlJc w:val="left"/>
+      <w:pPr>
+        <w:ind w:left="2880" w:hanging="360"/>
+      </w:pPr>
+      <w:rPr>
+        <w:rFonts w:ascii="Symbol" w:hAnsi="Symbol" w:hint="default"/>
+      </w:rPr>
+    </w:lvl>
+    <w:lvl w:ilvl="4" w:tplc="04090003" w:tentative="1">
+      <w:start w:val="1"/>
+      <w:numFmt w:val="bullet"/>
+      <w:lvlText w:val="o"/>
+      <w:lvlJc w:val="left"/>
+      <w:pPr>
+        <w:ind w:left="3600" w:hanging="360"/>
+      </w:pPr>
+      <w:rPr>
+        <w:rFonts w:ascii="Courier New" w:hAnsi="Courier New" w:cs="Courier New" w:hint="default"/>
+      </w:rPr>
+    </w:lvl>
+    <w:lvl w:ilvl="5" w:tplc="04090005" w:tentative="1">
+      <w:start w:val="1"/>
+      <w:numFmt w:val="bullet"/>
+      <w:lvlText w:val=""/>
+      <w:lvlJc w:val="left"/>
+      <w:pPr>
+        <w:ind w:left="4320" w:hanging="360"/>
+      </w:pPr>
+      <w:rPr>
+        <w:rFonts w:ascii="Wingdings" w:hAnsi="Wingdings" w:hint="default"/>
+      </w:rPr>
+    </w:lvl>
+    <w:lvl w:ilvl="6" w:tplc="04090001" w:tentative="1">
+      <w:start w:val="1"/>
+      <w:numFmt w:val="bullet"/>
+      <w:lvlText w:val=""/>
+      <w:lvlJc w:val="left"/>
+      <w:pPr>
+        <w:ind w:left="5040" w:hanging="360"/>
+      </w:pPr>
+      <w:rPr>
+        <w:rFonts w:ascii="Symbol" w:hAnsi="Symbol" w:hint="default"/>
+      </w:rPr>
+    </w:lvl>
+    <w:lvl w:ilvl="7" w:tplc="04090003" w:tentative="1">
+      <w:start w:val="1"/>
+      <w:numFmt w:val="bullet"/>
+      <w:lvlText w:val="o"/>
+      <w:lvlJc w:val="left"/>
+      <w:pPr>
+        <w:ind w:left="5760" w:hanging="360"/>
+      </w:pPr>
+      <w:rPr>
+        <w:rFonts w:ascii="Courier New" w:hAnsi="Courier New" w:cs="Courier New" w:hint="default"/>
+      </w:rPr>
+    </w:lvl>
+    <w:lvl w:ilvl="8" w:tplc="04090005" w:tentative="1">
+      <w:start w:val="1"/>
+      <w:numFmt w:val="bullet"/>
+      <w:lvlText w:val=""/>
+      <w:lvlJc w:val="left"/>
+      <w:pPr>
+        <w:ind w:left="6480" w:hanging="360"/>
+      </w:pPr>
+      <w:rPr>
+        <w:rFonts w:ascii="Wingdings" w:hAnsi="Wingdings" w:hint="default"/>
+      </w:rPr>
+    </w:lvl>
+  </w:abstractNum>
   <w:num w:numId="1" w16cid:durableId="1826894006">
+    <w:abstractNumId w:val="1"/>
+  </w:num>
+  <w:num w:numId="2" w16cid:durableId="1356157578">
+    <w:abstractNumId w:val="2"/>
+  </w:num>
+  <w:num w:numId="3" w16cid:durableId="73597206">
     <w:abstractNumId w:val="0"/>
+  </w:num>
+  <w:num w:numId="4" w16cid:durableId="690642894">
+    <w:abstractNumId w:val="3"/>
   </w:num>
 </w:numbering>
 </file>

</xml_diff>